<commit_message>
BL-12: Align SRS and RTM documentation
</commit_message>
<xml_diff>
--- a/docs/SRS-Template.docx
+++ b/docs/SRS-Template.docx
@@ -164,7 +164,7 @@
           <w:sz w:val="28"/>
           <w:szCs w:val="28"/>
         </w:rPr>
-        <w:t xml:space="preserve">Version 1.1.0</w:t>
+        <w:t>Version 1.1.1</w:t>
       </w:r>
       <w:r>
         <w:rPr>
@@ -274,7 +274,7 @@
         </w:sectPr>
       </w:pPr>
       <w:r>
-        <w:t xml:space="preserve">Created on – 08/09/2026 | Last updated – 17/10/2026</w:t>
+        <w:t>Created on – 08/09/2026 | Last updated – 24/10/2026</w:t>
       </w:r>
       <w:r>
         <w:rPr>
@@ -1755,6 +1755,64 @@
                 <w:b/>
                 <w:bCs/>
               </w:rPr>
+            </w:r>
+          </w:p>
+        </w:tc>
+      </w:tr>
+      <w:tr>
+        <w:tc>
+          <w:tcPr>
+            <w:tcW w:type="dxa" w:w="2340"/>
+          </w:tcPr>
+          <w:p>
+            <w:r>
+              <w:rPr>
+                <w:rFonts w:ascii="Arial" w:hAnsi="Arial"/>
+                <w:sz w:val="16"/>
+              </w:rPr>
+              <w:t>S. Kishore / project team</w:t>
+            </w:r>
+          </w:p>
+        </w:tc>
+        <w:tc>
+          <w:tcPr>
+            <w:tcW w:type="dxa" w:w="2340"/>
+          </w:tcPr>
+          <w:p>
+            <w:r>
+              <w:rPr>
+                <w:rFonts w:ascii="Arial" w:hAnsi="Arial"/>
+                <w:sz w:val="16"/>
+              </w:rPr>
+              <w:t>24/10/2026</w:t>
+            </w:r>
+          </w:p>
+        </w:tc>
+        <w:tc>
+          <w:tcPr>
+            <w:tcW w:type="dxa" w:w="2340"/>
+          </w:tcPr>
+          <w:p>
+            <w:r>
+              <w:rPr>
+                <w:rFonts w:ascii="Arial" w:hAnsi="Arial"/>
+                <w:sz w:val="16"/>
+              </w:rPr>
+              <w:t>Added the missing BR-2 row to Appendix C and aligned its backlog/sprint/test references.</w:t>
+            </w:r>
+          </w:p>
+        </w:tc>
+        <w:tc>
+          <w:tcPr>
+            <w:tcW w:type="dxa" w:w="2340"/>
+          </w:tcPr>
+          <w:p>
+            <w:r>
+              <w:rPr>
+                <w:rFonts w:ascii="Arial" w:hAnsi="Arial"/>
+                <w:sz w:val="16"/>
+              </w:rPr>
+              <w:t>1.1.1</w:t>
             </w:r>
           </w:p>
         </w:tc>
@@ -8961,7 +9019,7 @@
                 <w:sz w:val="16"/>
                 <w:szCs w:val="16"/>
               </w:rPr>
-              <w:t xml:space="preserve">Rooms.js/rooms.py</w:t>
+              <w:t>chat/rooms.py</w:t>
             </w:r>
             <w:r>
               <w:rPr>
@@ -9326,7 +9384,7 @@
                 <w:sz w:val="16"/>
                 <w:szCs w:val="16"/>
               </w:rPr>
-              <w:t xml:space="preserve">Rooms.js/rooms.py</w:t>
+              <w:t>chat/rooms.py</w:t>
             </w:r>
             <w:r>
               <w:rPr>
@@ -9691,7 +9749,7 @@
                 <w:sz w:val="16"/>
                 <w:szCs w:val="16"/>
               </w:rPr>
-              <w:t xml:space="preserve">Rooms.js/rooms.py; client JS</w:t>
+              <w:t>chat/rooms.py; client JS</w:t>
             </w:r>
             <w:r>
               <w:rPr>
@@ -10421,7 +10479,7 @@
                 <w:sz w:val="16"/>
                 <w:szCs w:val="16"/>
               </w:rPr>
-              <w:t xml:space="preserve">Rooms.js/rooms.py</w:t>
+              <w:t>chat/rooms.py</w:t>
             </w:r>
             <w:r>
               <w:rPr>
@@ -14225,6 +14283,148 @@
           </w:p>
         </w:tc>
       </w:tr>
+      <w:tr>
+        <w:tc>
+          <w:tcPr>
+            <w:tcW w:type="dxa" w:w="445"/>
+          </w:tcPr>
+          <w:p>
+            <w:r>
+              <w:rPr>
+                <w:rFonts w:ascii="Arial" w:hAnsi="Arial"/>
+                <w:sz w:val="16"/>
+              </w:rPr>
+              <w:t>21</w:t>
+            </w:r>
+          </w:p>
+        </w:tc>
+        <w:tc>
+          <w:tcPr>
+            <w:tcW w:type="dxa" w:w="1286"/>
+          </w:tcPr>
+          <w:p>
+            <w:r>
+              <w:rPr>
+                <w:rFonts w:ascii="Arial" w:hAnsi="Arial"/>
+                <w:sz w:val="16"/>
+              </w:rPr>
+              <w:t>BR-2</w:t>
+            </w:r>
+          </w:p>
+        </w:tc>
+        <w:tc>
+          <w:tcPr>
+            <w:tcW w:type="dxa" w:w="2377"/>
+          </w:tcPr>
+          <w:p>
+            <w:r>
+              <w:rPr>
+                <w:rFonts w:ascii="Arial" w:hAnsi="Arial"/>
+                <w:sz w:val="16"/>
+              </w:rPr>
+              <w:t>A user may be present in only one room at a time (see REQ-10)</w:t>
+            </w:r>
+          </w:p>
+        </w:tc>
+        <w:tc>
+          <w:tcPr>
+            <w:tcW w:type="dxa" w:w="1088"/>
+          </w:tcPr>
+          <w:p>
+            <w:r>
+              <w:rPr>
+                <w:rFonts w:ascii="Arial" w:hAnsi="Arial"/>
+                <w:sz w:val="16"/>
+              </w:rPr>
+              <w:t>Sec 5.5</w:t>
+            </w:r>
+          </w:p>
+        </w:tc>
+        <w:tc>
+          <w:tcPr>
+            <w:tcW w:type="dxa" w:w="1385"/>
+          </w:tcPr>
+          <w:p>
+            <w:r>
+              <w:rPr>
+                <w:rFonts w:ascii="Arial" w:hAnsi="Arial"/>
+                <w:sz w:val="16"/>
+              </w:rPr>
+              <w:t>Sec 4.3</w:t>
+            </w:r>
+          </w:p>
+        </w:tc>
+        <w:tc>
+          <w:tcPr>
+            <w:tcW w:type="dxa" w:w="1632"/>
+          </w:tcPr>
+          <w:p>
+            <w:r>
+              <w:rPr>
+                <w:rFonts w:ascii="Arial" w:hAnsi="Arial"/>
+                <w:sz w:val="16"/>
+              </w:rPr>
+              <w:t>chat/rooms.py</w:t>
+            </w:r>
+          </w:p>
+        </w:tc>
+        <w:tc>
+          <w:tcPr>
+            <w:tcW w:type="dxa" w:w="1830"/>
+          </w:tcPr>
+          <w:p>
+            <w:r>
+              <w:rPr>
+                <w:rFonts w:ascii="Arial" w:hAnsi="Arial"/>
+                <w:sz w:val="16"/>
+              </w:rPr>
+              <w:t>UT-10A–C, IT-10A–C</w:t>
+            </w:r>
+          </w:p>
+        </w:tc>
+        <w:tc>
+          <w:tcPr>
+            <w:tcW w:type="dxa" w:w="1038"/>
+          </w:tcPr>
+          <w:p>
+            <w:r>
+              <w:rPr>
+                <w:rFonts w:ascii="Arial" w:hAnsi="Arial"/>
+                <w:sz w:val="16"/>
+              </w:rPr>
+              <w:t>ST-10A–B</w:t>
+            </w:r>
+          </w:p>
+        </w:tc>
+        <w:tc>
+          <w:tcPr>
+            <w:tcW w:type="dxa" w:w="1088"/>
+          </w:tcPr>
+          <w:p>
+            <w:r>
+              <w:rPr>
+                <w:rFonts w:ascii="Arial" w:hAnsi="Arial"/>
+                <w:sz w:val="16"/>
+              </w:rPr>
+              <w:t>BL-16</w:t>
+            </w:r>
+          </w:p>
+        </w:tc>
+        <w:tc>
+          <w:tcPr>
+            <w:tcW w:type="dxa" w:w="791"/>
+          </w:tcPr>
+          <w:p>
+            <w:r>
+              <w:rPr>
+                <w:rFonts w:ascii="Arial" w:hAnsi="Arial"/>
+                <w:sz w:val="16"/>
+              </w:rPr>
+              <w:t>2</w:t>
+            </w:r>
+          </w:p>
+        </w:tc>
+      </w:tr>
     </w:tbl>
     <w:p>
       <w:pPr>
@@ -14284,6 +14484,17 @@
         <w:rPr>
           <w:rFonts w:ascii="Times New Roman" w:hAnsi="Times New Roman" w:eastAsia="Times New Roman" w:cs="Times New Roman"/>
         </w:rPr>
+      </w:r>
+    </w:p>
+    <w:p>
+      <w:r>
+        <w:rPr>
+          <w:b/>
+        </w:rPr>
+        <w:t xml:space="preserve">RTM maintenance note: </w:t>
+      </w:r>
+      <w:r>
+        <w:t>Appendix C includes BR-2 as a separately traceable business rule. It maps to REQ-10, backlog item BL-16, Sprint 2, and the existing UT-10 / IT-10 / ST-10 test cases.</w:t>
       </w:r>
     </w:p>
     <w:sectPr>

</xml_diff>